<commit_message>
docs: Thêm chú ý khi sử dụng Git
</commit_message>
<xml_diff>
--- a/Docs/useGit.docx
+++ b/Docs/useGit.docx
@@ -4,25 +4,541 @@
   <w:body>
     <w:p>
       <w:pPr>
-        <w:rPr>
-          <w:b/>
-          <w:bCs/>
-        </w:rPr>
-      </w:pPr>
-      <w:r>
-        <w:rPr>
-          <w:b/>
-          <w:bCs/>
-        </w:rPr>
-        <w:t xml:space="preserve">1. </w:t>
-      </w:r>
-      <w:proofErr w:type="spellStart"/>
-      <w:r>
-        <w:rPr>
-          <w:b/>
-          <w:bCs/>
-        </w:rPr>
-        <w:t>Cấu</w:t>
+        <w:pStyle w:val="ListParagraph"/>
+        <w:numPr>
+          <w:ilvl w:val="0"/>
+          <w:numId w:val="4"/>
+        </w:numPr>
+        <w:rPr>
+          <w:b/>
+          <w:bCs/>
+        </w:rPr>
+      </w:pPr>
+      <w:proofErr w:type="spellStart"/>
+      <w:r>
+        <w:rPr>
+          <w:b/>
+          <w:bCs/>
+        </w:rPr>
+        <w:t>Một</w:t>
+      </w:r>
+      <w:proofErr w:type="spellEnd"/>
+      <w:r>
+        <w:rPr>
+          <w:b/>
+          <w:bCs/>
+        </w:rPr>
+        <w:t xml:space="preserve"> </w:t>
+      </w:r>
+      <w:proofErr w:type="spellStart"/>
+      <w:r>
+        <w:rPr>
+          <w:b/>
+          <w:bCs/>
+        </w:rPr>
+        <w:t>số</w:t>
+      </w:r>
+      <w:proofErr w:type="spellEnd"/>
+      <w:r>
+        <w:rPr>
+          <w:b/>
+          <w:bCs/>
+        </w:rPr>
+        <w:t xml:space="preserve"> </w:t>
+      </w:r>
+      <w:proofErr w:type="spellStart"/>
+      <w:r>
+        <w:rPr>
+          <w:b/>
+          <w:bCs/>
+        </w:rPr>
+        <w:t>lệnh</w:t>
+      </w:r>
+      <w:proofErr w:type="spellEnd"/>
+      <w:r>
+        <w:rPr>
+          <w:b/>
+          <w:bCs/>
+        </w:rPr>
+        <w:t xml:space="preserve"> git </w:t>
+      </w:r>
+      <w:proofErr w:type="spellStart"/>
+      <w:r>
+        <w:rPr>
+          <w:b/>
+          <w:bCs/>
+        </w:rPr>
+        <w:t>phổ</w:t>
+      </w:r>
+      <w:proofErr w:type="spellEnd"/>
+      <w:r>
+        <w:rPr>
+          <w:b/>
+          <w:bCs/>
+        </w:rPr>
+        <w:t xml:space="preserve"> </w:t>
+      </w:r>
+      <w:proofErr w:type="spellStart"/>
+      <w:r>
+        <w:rPr>
+          <w:b/>
+          <w:bCs/>
+        </w:rPr>
+        <w:t>biến</w:t>
+      </w:r>
+      <w:proofErr w:type="spellEnd"/>
+    </w:p>
+    <w:p>
+      <w:pPr>
+        <w:pStyle w:val="ListParagraph"/>
+        <w:ind w:left="360"/>
+        <w:rPr>
+          <w:rFonts w:ascii="Consolas" w:hAnsi="Consolas"/>
+        </w:rPr>
+      </w:pPr>
+      <w:r>
+        <w:rPr>
+          <w:rFonts w:ascii="Consolas" w:hAnsi="Consolas"/>
+        </w:rPr>
+        <w:t xml:space="preserve">- git clone </w:t>
+      </w:r>
+      <w:proofErr w:type="spellStart"/>
+      <w:r>
+        <w:rPr>
+          <w:rFonts w:ascii="Consolas" w:hAnsi="Consolas"/>
+        </w:rPr>
+        <w:t>link_repo</w:t>
+      </w:r>
+      <w:proofErr w:type="spellEnd"/>
+      <w:r>
+        <w:rPr>
+          <w:rFonts w:ascii="Consolas" w:hAnsi="Consolas"/>
+        </w:rPr>
+        <w:t xml:space="preserve">: clone </w:t>
+      </w:r>
+      <w:proofErr w:type="spellStart"/>
+      <w:r>
+        <w:rPr>
+          <w:rFonts w:ascii="Consolas" w:hAnsi="Consolas"/>
+        </w:rPr>
+        <w:t>dự</w:t>
+      </w:r>
+      <w:proofErr w:type="spellEnd"/>
+      <w:r>
+        <w:rPr>
+          <w:rFonts w:ascii="Consolas" w:hAnsi="Consolas"/>
+        </w:rPr>
+        <w:t xml:space="preserve"> </w:t>
+      </w:r>
+      <w:proofErr w:type="spellStart"/>
+      <w:r>
+        <w:rPr>
+          <w:rFonts w:ascii="Consolas" w:hAnsi="Consolas"/>
+        </w:rPr>
+        <w:t>án</w:t>
+      </w:r>
+      <w:proofErr w:type="spellEnd"/>
+      <w:r>
+        <w:rPr>
+          <w:rFonts w:ascii="Consolas" w:hAnsi="Consolas"/>
+        </w:rPr>
+        <w:t xml:space="preserve"> </w:t>
+      </w:r>
+      <w:proofErr w:type="spellStart"/>
+      <w:r>
+        <w:rPr>
+          <w:rFonts w:ascii="Consolas" w:hAnsi="Consolas"/>
+        </w:rPr>
+        <w:t>về</w:t>
+      </w:r>
+      <w:proofErr w:type="spellEnd"/>
+    </w:p>
+    <w:p>
+      <w:pPr>
+        <w:pStyle w:val="ListParagraph"/>
+        <w:ind w:left="360"/>
+        <w:rPr>
+          <w:rFonts w:ascii="Consolas" w:hAnsi="Consolas"/>
+        </w:rPr>
+      </w:pPr>
+      <w:r>
+        <w:rPr>
+          <w:rFonts w:ascii="Consolas" w:hAnsi="Consolas"/>
+        </w:rPr>
+        <w:t xml:space="preserve">- git checkout </w:t>
+      </w:r>
+      <w:proofErr w:type="spellStart"/>
+      <w:r>
+        <w:rPr>
+          <w:rFonts w:ascii="Consolas" w:hAnsi="Consolas"/>
+        </w:rPr>
+        <w:t>name_branch</w:t>
+      </w:r>
+      <w:proofErr w:type="spellEnd"/>
+      <w:r>
+        <w:rPr>
+          <w:rFonts w:ascii="Consolas" w:hAnsi="Consolas"/>
+        </w:rPr>
+        <w:t xml:space="preserve">: </w:t>
+      </w:r>
+      <w:proofErr w:type="spellStart"/>
+      <w:r>
+        <w:rPr>
+          <w:rFonts w:ascii="Consolas" w:hAnsi="Consolas"/>
+        </w:rPr>
+        <w:t>đổi</w:t>
+      </w:r>
+      <w:proofErr w:type="spellEnd"/>
+      <w:r>
+        <w:rPr>
+          <w:rFonts w:ascii="Consolas" w:hAnsi="Consolas"/>
+        </w:rPr>
+        <w:t xml:space="preserve"> sang </w:t>
+      </w:r>
+      <w:proofErr w:type="spellStart"/>
+      <w:r>
+        <w:rPr>
+          <w:rFonts w:ascii="Consolas" w:hAnsi="Consolas"/>
+        </w:rPr>
+        <w:t>nhánh</w:t>
+      </w:r>
+      <w:proofErr w:type="spellEnd"/>
+      <w:r>
+        <w:rPr>
+          <w:rFonts w:ascii="Consolas" w:hAnsi="Consolas"/>
+        </w:rPr>
+        <w:t xml:space="preserve"> </w:t>
+      </w:r>
+      <w:proofErr w:type="spellStart"/>
+      <w:r>
+        <w:rPr>
+          <w:rFonts w:ascii="Consolas" w:hAnsi="Consolas"/>
+        </w:rPr>
+        <w:t>name_branch</w:t>
+      </w:r>
+      <w:proofErr w:type="spellEnd"/>
+    </w:p>
+    <w:p>
+      <w:pPr>
+        <w:pStyle w:val="ListParagraph"/>
+        <w:ind w:left="360"/>
+        <w:rPr>
+          <w:rFonts w:ascii="Consolas" w:hAnsi="Consolas"/>
+        </w:rPr>
+      </w:pPr>
+      <w:r>
+        <w:rPr>
+          <w:rFonts w:ascii="Consolas" w:hAnsi="Consolas"/>
+        </w:rPr>
+        <w:t xml:space="preserve">- git checkout -b </w:t>
+      </w:r>
+      <w:proofErr w:type="spellStart"/>
+      <w:r>
+        <w:rPr>
+          <w:rFonts w:ascii="Consolas" w:hAnsi="Consolas"/>
+        </w:rPr>
+        <w:t>branch_a</w:t>
+      </w:r>
+      <w:proofErr w:type="spellEnd"/>
+      <w:r>
+        <w:rPr>
+          <w:rFonts w:ascii="Consolas" w:hAnsi="Consolas"/>
+        </w:rPr>
+        <w:t xml:space="preserve">: </w:t>
+      </w:r>
+      <w:proofErr w:type="spellStart"/>
+      <w:r>
+        <w:rPr>
+          <w:rFonts w:ascii="Consolas" w:hAnsi="Consolas"/>
+        </w:rPr>
+        <w:t>tạo</w:t>
+      </w:r>
+      <w:proofErr w:type="spellEnd"/>
+      <w:r>
+        <w:rPr>
+          <w:rFonts w:ascii="Consolas" w:hAnsi="Consolas"/>
+        </w:rPr>
+        <w:t xml:space="preserve"> </w:t>
+      </w:r>
+      <w:proofErr w:type="spellStart"/>
+      <w:r>
+        <w:rPr>
+          <w:rFonts w:ascii="Consolas" w:hAnsi="Consolas"/>
+        </w:rPr>
+        <w:t>và</w:t>
+      </w:r>
+      <w:proofErr w:type="spellEnd"/>
+      <w:r>
+        <w:rPr>
+          <w:rFonts w:ascii="Consolas" w:hAnsi="Consolas"/>
+        </w:rPr>
+        <w:t xml:space="preserve"> </w:t>
+      </w:r>
+      <w:proofErr w:type="spellStart"/>
+      <w:r>
+        <w:rPr>
+          <w:rFonts w:ascii="Consolas" w:hAnsi="Consolas"/>
+        </w:rPr>
+        <w:t>đổi</w:t>
+      </w:r>
+      <w:proofErr w:type="spellEnd"/>
+      <w:r>
+        <w:rPr>
+          <w:rFonts w:ascii="Consolas" w:hAnsi="Consolas"/>
+        </w:rPr>
+        <w:t xml:space="preserve"> sang </w:t>
+      </w:r>
+      <w:proofErr w:type="spellStart"/>
+      <w:r>
+        <w:rPr>
+          <w:rFonts w:ascii="Consolas" w:hAnsi="Consolas"/>
+        </w:rPr>
+        <w:t>nhánh</w:t>
+      </w:r>
+      <w:proofErr w:type="spellEnd"/>
+      <w:r>
+        <w:rPr>
+          <w:rFonts w:ascii="Consolas" w:hAnsi="Consolas"/>
+        </w:rPr>
+        <w:t xml:space="preserve"> </w:t>
+      </w:r>
+      <w:proofErr w:type="spellStart"/>
+      <w:r>
+        <w:rPr>
+          <w:rFonts w:ascii="Consolas" w:hAnsi="Consolas"/>
+        </w:rPr>
+        <w:t>branh_a</w:t>
+      </w:r>
+      <w:proofErr w:type="spellEnd"/>
+    </w:p>
+    <w:p>
+      <w:pPr>
+        <w:pStyle w:val="ListParagraph"/>
+        <w:ind w:left="360"/>
+        <w:rPr>
+          <w:rFonts w:ascii="Consolas" w:hAnsi="Consolas"/>
+        </w:rPr>
+      </w:pPr>
+      <w:r>
+        <w:rPr>
+          <w:rFonts w:ascii="Consolas" w:hAnsi="Consolas"/>
+        </w:rPr>
+        <w:t xml:space="preserve">- git pull origin </w:t>
+      </w:r>
+      <w:proofErr w:type="spellStart"/>
+      <w:r>
+        <w:rPr>
+          <w:rFonts w:ascii="Consolas" w:hAnsi="Consolas"/>
+        </w:rPr>
+        <w:t>branch_b</w:t>
+      </w:r>
+      <w:proofErr w:type="spellEnd"/>
+      <w:r>
+        <w:rPr>
+          <w:rFonts w:ascii="Consolas" w:hAnsi="Consolas"/>
+        </w:rPr>
+        <w:t xml:space="preserve">: </w:t>
+      </w:r>
+      <w:proofErr w:type="spellStart"/>
+      <w:r>
+        <w:rPr>
+          <w:rFonts w:ascii="Consolas" w:hAnsi="Consolas"/>
+        </w:rPr>
+        <w:t>cập</w:t>
+      </w:r>
+      <w:proofErr w:type="spellEnd"/>
+      <w:r>
+        <w:rPr>
+          <w:rFonts w:ascii="Consolas" w:hAnsi="Consolas"/>
+        </w:rPr>
+        <w:t xml:space="preserve"> </w:t>
+      </w:r>
+      <w:proofErr w:type="spellStart"/>
+      <w:r>
+        <w:rPr>
+          <w:rFonts w:ascii="Consolas" w:hAnsi="Consolas"/>
+        </w:rPr>
+        <w:t>nhật</w:t>
+      </w:r>
+      <w:proofErr w:type="spellEnd"/>
+      <w:r>
+        <w:rPr>
+          <w:rFonts w:ascii="Consolas" w:hAnsi="Consolas"/>
+        </w:rPr>
+        <w:t xml:space="preserve"> </w:t>
+      </w:r>
+      <w:proofErr w:type="spellStart"/>
+      <w:r>
+        <w:rPr>
+          <w:rFonts w:ascii="Consolas" w:hAnsi="Consolas"/>
+        </w:rPr>
+        <w:t>lại</w:t>
+      </w:r>
+      <w:proofErr w:type="spellEnd"/>
+      <w:r>
+        <w:rPr>
+          <w:rFonts w:ascii="Consolas" w:hAnsi="Consolas"/>
+        </w:rPr>
+        <w:t xml:space="preserve"> </w:t>
+      </w:r>
+      <w:proofErr w:type="spellStart"/>
+      <w:r>
+        <w:rPr>
+          <w:rFonts w:ascii="Consolas" w:hAnsi="Consolas"/>
+        </w:rPr>
+        <w:t>nhánh</w:t>
+      </w:r>
+      <w:proofErr w:type="spellEnd"/>
+      <w:r>
+        <w:rPr>
+          <w:rFonts w:ascii="Consolas" w:hAnsi="Consolas"/>
+        </w:rPr>
+        <w:t xml:space="preserve"> b</w:t>
+      </w:r>
+    </w:p>
+    <w:p>
+      <w:pPr>
+        <w:pStyle w:val="ListParagraph"/>
+        <w:ind w:left="360"/>
+        <w:rPr>
+          <w:rFonts w:ascii="Consolas" w:hAnsi="Consolas"/>
+        </w:rPr>
+      </w:pPr>
+      <w:r>
+        <w:rPr>
+          <w:rFonts w:ascii="Consolas" w:hAnsi="Consolas"/>
+        </w:rPr>
+        <w:t xml:space="preserve">- Commit/Push </w:t>
+      </w:r>
+      <w:proofErr w:type="spellStart"/>
+      <w:r>
+        <w:rPr>
+          <w:rFonts w:ascii="Consolas" w:hAnsi="Consolas"/>
+        </w:rPr>
+        <w:t>dùng</w:t>
+      </w:r>
+      <w:proofErr w:type="spellEnd"/>
+      <w:r>
+        <w:rPr>
+          <w:rFonts w:ascii="Consolas" w:hAnsi="Consolas"/>
+        </w:rPr>
+        <w:t xml:space="preserve"> </w:t>
+      </w:r>
+      <w:proofErr w:type="spellStart"/>
+      <w:r>
+        <w:rPr>
+          <w:rFonts w:ascii="Consolas" w:hAnsi="Consolas"/>
+        </w:rPr>
+        <w:t>giao</w:t>
+      </w:r>
+      <w:proofErr w:type="spellEnd"/>
+      <w:r>
+        <w:rPr>
+          <w:rFonts w:ascii="Consolas" w:hAnsi="Consolas"/>
+        </w:rPr>
+        <w:t xml:space="preserve"> </w:t>
+      </w:r>
+      <w:proofErr w:type="spellStart"/>
+      <w:r>
+        <w:rPr>
+          <w:rFonts w:ascii="Consolas" w:hAnsi="Consolas"/>
+        </w:rPr>
+        <w:t>diện</w:t>
+      </w:r>
+      <w:proofErr w:type="spellEnd"/>
+      <w:r>
+        <w:rPr>
+          <w:rFonts w:ascii="Consolas" w:hAnsi="Consolas"/>
+        </w:rPr>
+        <w:t xml:space="preserve"> </w:t>
+      </w:r>
+      <w:proofErr w:type="spellStart"/>
+      <w:r>
+        <w:rPr>
+          <w:rFonts w:ascii="Consolas" w:hAnsi="Consolas"/>
+        </w:rPr>
+        <w:t>Vscode</w:t>
+      </w:r>
+      <w:proofErr w:type="spellEnd"/>
+    </w:p>
+    <w:p>
+      <w:pPr>
+        <w:pStyle w:val="ListParagraph"/>
+        <w:ind w:left="360"/>
+        <w:rPr>
+          <w:rFonts w:ascii="Consolas" w:hAnsi="Consolas"/>
+        </w:rPr>
+      </w:pPr>
+      <w:r>
+        <w:rPr>
+          <w:rFonts w:ascii="Consolas" w:hAnsi="Consolas"/>
+        </w:rPr>
+        <w:t xml:space="preserve">- </w:t>
+      </w:r>
+      <w:proofErr w:type="spellStart"/>
+      <w:r>
+        <w:rPr>
+          <w:rFonts w:ascii="Consolas" w:hAnsi="Consolas"/>
+        </w:rPr>
+        <w:t>Tạo</w:t>
+      </w:r>
+      <w:proofErr w:type="spellEnd"/>
+      <w:r>
+        <w:rPr>
+          <w:rFonts w:ascii="Consolas" w:hAnsi="Consolas"/>
+        </w:rPr>
+        <w:t xml:space="preserve"> pull request </w:t>
+      </w:r>
+      <w:proofErr w:type="spellStart"/>
+      <w:r>
+        <w:rPr>
+          <w:rFonts w:ascii="Consolas" w:hAnsi="Consolas"/>
+        </w:rPr>
+        <w:t>trước</w:t>
+      </w:r>
+      <w:proofErr w:type="spellEnd"/>
+      <w:r>
+        <w:rPr>
+          <w:rFonts w:ascii="Consolas" w:hAnsi="Consolas"/>
+        </w:rPr>
+        <w:t xml:space="preserve"> </w:t>
+      </w:r>
+      <w:proofErr w:type="spellStart"/>
+      <w:r>
+        <w:rPr>
+          <w:rFonts w:ascii="Consolas" w:hAnsi="Consolas"/>
+        </w:rPr>
+        <w:t>khi</w:t>
+      </w:r>
+      <w:proofErr w:type="spellEnd"/>
+      <w:r>
+        <w:rPr>
+          <w:rFonts w:ascii="Consolas" w:hAnsi="Consolas"/>
+        </w:rPr>
+        <w:t xml:space="preserve"> merge</w:t>
+      </w:r>
+    </w:p>
+    <w:p>
+      <w:pPr>
+        <w:rPr>
+          <w:b/>
+          <w:bCs/>
+        </w:rPr>
+      </w:pPr>
+      <w:r>
+        <w:rPr>
+          <w:b/>
+          <w:bCs/>
+        </w:rPr>
+        <w:t>1. C</w:t>
+      </w:r>
+      <w:proofErr w:type="spellStart"/>
+      <w:r>
+        <w:rPr>
+          <w:b/>
+          <w:bCs/>
+        </w:rPr>
+        <w:t>ấu</w:t>
       </w:r>
       <w:proofErr w:type="spellEnd"/>
       <w:r>
@@ -377,7 +893,7 @@
     <w:p>
       <w:r>
         <w:pict w14:anchorId="09446F00">
-          <v:rect id="_x0000_i1043" style="width:0;height:1.5pt" o:hralign="center" o:hrstd="t" o:hr="t" fillcolor="#a0a0a0" stroked="f"/>
+          <v:rect id="_x0000_i1049" style="width:0;height:1.5pt" o:hralign="center" o:hrstd="t" o:hr="t" fillcolor="#a0a0a0" stroked="f"/>
         </w:pict>
       </w:r>
     </w:p>
@@ -1490,6 +2006,7 @@
                 <w:b/>
                 <w:bCs/>
               </w:rPr>
+              <w:lastRenderedPageBreak/>
               <w:t>chore</w:t>
             </w:r>
           </w:p>
@@ -1617,7 +2134,7 @@
     <w:p>
       <w:r>
         <w:pict w14:anchorId="21630C3F">
-          <v:rect id="_x0000_i1044" style="width:0;height:1.5pt" o:hralign="center" o:hrstd="t" o:hr="t" fillcolor="#a0a0a0" stroked="f"/>
+          <v:rect id="_x0000_i1050" style="width:0;height:1.5pt" o:hralign="center" o:hrstd="t" o:hr="t" fillcolor="#a0a0a0" stroked="f"/>
         </w:pict>
       </w:r>
     </w:p>
@@ -1693,7 +2210,6 @@
       </w:pPr>
       <w:proofErr w:type="spellStart"/>
       <w:r>
-        <w:lastRenderedPageBreak/>
         <w:t>fe</w:t>
       </w:r>
       <w:proofErr w:type="spellEnd"/>
@@ -1933,7 +2449,7 @@
     <w:p>
       <w:r>
         <w:pict w14:anchorId="6FD99E08">
-          <v:rect id="_x0000_i1045" style="width:0;height:1.5pt" o:hralign="center" o:hrstd="t" o:hr="t" fillcolor="#a0a0a0" stroked="f"/>
+          <v:rect id="_x0000_i1051" style="width:0;height:1.5pt" o:hralign="center" o:hrstd="t" o:hr="t" fillcolor="#a0a0a0" stroked="f"/>
         </w:pict>
       </w:r>
     </w:p>
@@ -2266,7 +2782,7 @@
     <w:p>
       <w:r>
         <w:pict w14:anchorId="63E50A45">
-          <v:rect id="_x0000_i1049" style="width:0;height:1.5pt" o:hralign="center" o:hrstd="t" o:hr="t" fillcolor="#a0a0a0" stroked="f"/>
+          <v:rect id="_x0000_i1052" style="width:0;height:1.5pt" o:hralign="center" o:hrstd="t" o:hr="t" fillcolor="#a0a0a0" stroked="f"/>
         </w:pict>
       </w:r>
     </w:p>
@@ -2849,6 +3365,7 @@
     </w:p>
     <w:p>
       <w:r>
+        <w:lastRenderedPageBreak/>
         <w:t xml:space="preserve">chore: </w:t>
       </w:r>
       <w:proofErr w:type="spellStart"/>
@@ -3377,6 +3894,94 @@
       </w:rPr>
     </w:lvl>
   </w:abstractNum>
+  <w:abstractNum w:abstractNumId="3" w15:restartNumberingAfterBreak="0">
+    <w:nsid w:val="7954669B"/>
+    <w:multiLevelType w:val="hybridMultilevel"/>
+    <w:tmpl w:val="6CAEDF9E"/>
+    <w:lvl w:ilvl="0" w:tplc="0409000F">
+      <w:numFmt w:val="decimal"/>
+      <w:lvlText w:val="%1."/>
+      <w:lvlJc w:val="left"/>
+      <w:pPr>
+        <w:ind w:left="360" w:hanging="360"/>
+      </w:pPr>
+      <w:rPr>
+        <w:rFonts w:hint="default"/>
+      </w:rPr>
+    </w:lvl>
+    <w:lvl w:ilvl="1" w:tplc="04090019">
+      <w:start w:val="1"/>
+      <w:numFmt w:val="lowerLetter"/>
+      <w:lvlText w:val="%2."/>
+      <w:lvlJc w:val="left"/>
+      <w:pPr>
+        <w:ind w:left="1080" w:hanging="360"/>
+      </w:pPr>
+    </w:lvl>
+    <w:lvl w:ilvl="2" w:tplc="0409001B" w:tentative="1">
+      <w:start w:val="1"/>
+      <w:numFmt w:val="lowerRoman"/>
+      <w:lvlText w:val="%3."/>
+      <w:lvlJc w:val="right"/>
+      <w:pPr>
+        <w:ind w:left="1800" w:hanging="180"/>
+      </w:pPr>
+    </w:lvl>
+    <w:lvl w:ilvl="3" w:tplc="0409000F" w:tentative="1">
+      <w:start w:val="1"/>
+      <w:numFmt w:val="decimal"/>
+      <w:lvlText w:val="%4."/>
+      <w:lvlJc w:val="left"/>
+      <w:pPr>
+        <w:ind w:left="2520" w:hanging="360"/>
+      </w:pPr>
+    </w:lvl>
+    <w:lvl w:ilvl="4" w:tplc="04090019" w:tentative="1">
+      <w:start w:val="1"/>
+      <w:numFmt w:val="lowerLetter"/>
+      <w:lvlText w:val="%5."/>
+      <w:lvlJc w:val="left"/>
+      <w:pPr>
+        <w:ind w:left="3240" w:hanging="360"/>
+      </w:pPr>
+    </w:lvl>
+    <w:lvl w:ilvl="5" w:tplc="0409001B" w:tentative="1">
+      <w:start w:val="1"/>
+      <w:numFmt w:val="lowerRoman"/>
+      <w:lvlText w:val="%6."/>
+      <w:lvlJc w:val="right"/>
+      <w:pPr>
+        <w:ind w:left="3960" w:hanging="180"/>
+      </w:pPr>
+    </w:lvl>
+    <w:lvl w:ilvl="6" w:tplc="0409000F" w:tentative="1">
+      <w:start w:val="1"/>
+      <w:numFmt w:val="decimal"/>
+      <w:lvlText w:val="%7."/>
+      <w:lvlJc w:val="left"/>
+      <w:pPr>
+        <w:ind w:left="4680" w:hanging="360"/>
+      </w:pPr>
+    </w:lvl>
+    <w:lvl w:ilvl="7" w:tplc="04090019" w:tentative="1">
+      <w:start w:val="1"/>
+      <w:numFmt w:val="lowerLetter"/>
+      <w:lvlText w:val="%8."/>
+      <w:lvlJc w:val="left"/>
+      <w:pPr>
+        <w:ind w:left="5400" w:hanging="360"/>
+      </w:pPr>
+    </w:lvl>
+    <w:lvl w:ilvl="8" w:tplc="0409001B" w:tentative="1">
+      <w:start w:val="1"/>
+      <w:numFmt w:val="lowerRoman"/>
+      <w:lvlText w:val="%9."/>
+      <w:lvlJc w:val="right"/>
+      <w:pPr>
+        <w:ind w:left="6120" w:hanging="180"/>
+      </w:pPr>
+    </w:lvl>
+  </w:abstractNum>
   <w:num w:numId="1" w16cid:durableId="402291668">
     <w:abstractNumId w:val="0"/>
   </w:num>
@@ -3385,6 +3990,9 @@
   </w:num>
   <w:num w:numId="3" w16cid:durableId="1617635488">
     <w:abstractNumId w:val="2"/>
+  </w:num>
+  <w:num w:numId="4" w16cid:durableId="1398670557">
+    <w:abstractNumId w:val="3"/>
   </w:num>
 </w:numbering>
 </file>

</xml_diff>

<commit_message>
docs: Thêm lưu ý khi sử dụng Git
</commit_message>
<xml_diff>
--- a/Docs/useGit.docx
+++ b/Docs/useGit.docx
@@ -520,25 +520,217 @@
     </w:p>
     <w:p>
       <w:pPr>
-        <w:rPr>
-          <w:b/>
-          <w:bCs/>
-        </w:rPr>
-      </w:pPr>
-      <w:r>
-        <w:rPr>
-          <w:b/>
-          <w:bCs/>
-        </w:rPr>
-        <w:t>1. C</w:t>
-      </w:r>
-      <w:proofErr w:type="spellStart"/>
-      <w:r>
-        <w:rPr>
-          <w:b/>
-          <w:bCs/>
-        </w:rPr>
-        <w:t>ấu</w:t>
+        <w:pStyle w:val="ListParagraph"/>
+        <w:ind w:left="360"/>
+        <w:rPr>
+          <w:rFonts w:ascii="Consolas" w:hAnsi="Consolas"/>
+        </w:rPr>
+      </w:pPr>
+      <w:r>
+        <w:rPr>
+          <w:rFonts w:ascii="Consolas" w:hAnsi="Consolas"/>
+          <w:highlight w:val="yellow"/>
+        </w:rPr>
+        <w:t xml:space="preserve">- </w:t>
+      </w:r>
+      <w:proofErr w:type="spellStart"/>
+      <w:r>
+        <w:rPr>
+          <w:rFonts w:ascii="Consolas" w:hAnsi="Consolas"/>
+          <w:highlight w:val="yellow"/>
+        </w:rPr>
+        <w:t>Luôn</w:t>
+      </w:r>
+      <w:proofErr w:type="spellEnd"/>
+      <w:r>
+        <w:rPr>
+          <w:rFonts w:ascii="Consolas" w:hAnsi="Consolas"/>
+          <w:highlight w:val="yellow"/>
+        </w:rPr>
+        <w:t xml:space="preserve"> </w:t>
+      </w:r>
+      <w:proofErr w:type="spellStart"/>
+      <w:r>
+        <w:rPr>
+          <w:rFonts w:ascii="Consolas" w:hAnsi="Consolas"/>
+          <w:highlight w:val="yellow"/>
+        </w:rPr>
+        <w:t>phải</w:t>
+      </w:r>
+      <w:proofErr w:type="spellEnd"/>
+      <w:r>
+        <w:rPr>
+          <w:rFonts w:ascii="Consolas" w:hAnsi="Consolas"/>
+          <w:highlight w:val="yellow"/>
+        </w:rPr>
+        <w:t xml:space="preserve"> </w:t>
+      </w:r>
+      <w:proofErr w:type="spellStart"/>
+      <w:r>
+        <w:rPr>
+          <w:rFonts w:ascii="Consolas" w:hAnsi="Consolas"/>
+          <w:highlight w:val="yellow"/>
+        </w:rPr>
+        <w:t>chú</w:t>
+      </w:r>
+      <w:proofErr w:type="spellEnd"/>
+      <w:r>
+        <w:rPr>
+          <w:rFonts w:ascii="Consolas" w:hAnsi="Consolas"/>
+          <w:highlight w:val="yellow"/>
+        </w:rPr>
+        <w:t xml:space="preserve"> ý </w:t>
+      </w:r>
+      <w:proofErr w:type="spellStart"/>
+      <w:r>
+        <w:rPr>
+          <w:rFonts w:ascii="Consolas" w:hAnsi="Consolas"/>
+          <w:highlight w:val="yellow"/>
+        </w:rPr>
+        <w:t>mình</w:t>
+      </w:r>
+      <w:proofErr w:type="spellEnd"/>
+      <w:r>
+        <w:rPr>
+          <w:rFonts w:ascii="Consolas" w:hAnsi="Consolas"/>
+          <w:highlight w:val="yellow"/>
+        </w:rPr>
+        <w:t xml:space="preserve"> </w:t>
+      </w:r>
+      <w:proofErr w:type="spellStart"/>
+      <w:r>
+        <w:rPr>
+          <w:rFonts w:ascii="Consolas" w:hAnsi="Consolas"/>
+          <w:highlight w:val="yellow"/>
+        </w:rPr>
+        <w:t>đang</w:t>
+      </w:r>
+      <w:proofErr w:type="spellEnd"/>
+      <w:r>
+        <w:rPr>
+          <w:rFonts w:ascii="Consolas" w:hAnsi="Consolas"/>
+          <w:highlight w:val="yellow"/>
+        </w:rPr>
+        <w:t xml:space="preserve"> ở </w:t>
+      </w:r>
+      <w:proofErr w:type="spellStart"/>
+      <w:r>
+        <w:rPr>
+          <w:rFonts w:ascii="Consolas" w:hAnsi="Consolas"/>
+          <w:highlight w:val="yellow"/>
+        </w:rPr>
+        <w:t>nhánh</w:t>
+      </w:r>
+      <w:proofErr w:type="spellEnd"/>
+      <w:r>
+        <w:rPr>
+          <w:rFonts w:ascii="Consolas" w:hAnsi="Consolas"/>
+          <w:highlight w:val="yellow"/>
+        </w:rPr>
+        <w:t xml:space="preserve"> </w:t>
+      </w:r>
+      <w:proofErr w:type="spellStart"/>
+      <w:r>
+        <w:rPr>
+          <w:rFonts w:ascii="Consolas" w:hAnsi="Consolas"/>
+          <w:highlight w:val="yellow"/>
+        </w:rPr>
+        <w:t>nào</w:t>
+      </w:r>
+      <w:proofErr w:type="spellEnd"/>
+      <w:r>
+        <w:rPr>
+          <w:rFonts w:ascii="Consolas" w:hAnsi="Consolas"/>
+          <w:highlight w:val="yellow"/>
+        </w:rPr>
+        <w:t xml:space="preserve"> </w:t>
+      </w:r>
+      <w:proofErr w:type="spellStart"/>
+      <w:r>
+        <w:rPr>
+          <w:rFonts w:ascii="Consolas" w:hAnsi="Consolas"/>
+          <w:highlight w:val="yellow"/>
+        </w:rPr>
+        <w:t>trước</w:t>
+      </w:r>
+      <w:proofErr w:type="spellEnd"/>
+      <w:r>
+        <w:rPr>
+          <w:rFonts w:ascii="Consolas" w:hAnsi="Consolas"/>
+          <w:highlight w:val="yellow"/>
+        </w:rPr>
+        <w:t xml:space="preserve"> </w:t>
+      </w:r>
+      <w:proofErr w:type="spellStart"/>
+      <w:r>
+        <w:rPr>
+          <w:rFonts w:ascii="Consolas" w:hAnsi="Consolas"/>
+          <w:highlight w:val="yellow"/>
+        </w:rPr>
+        <w:t>khi</w:t>
+      </w:r>
+      <w:proofErr w:type="spellEnd"/>
+      <w:r>
+        <w:rPr>
+          <w:rFonts w:ascii="Consolas" w:hAnsi="Consolas"/>
+          <w:highlight w:val="yellow"/>
+        </w:rPr>
+        <w:t xml:space="preserve"> </w:t>
+      </w:r>
+      <w:proofErr w:type="spellStart"/>
+      <w:r>
+        <w:rPr>
+          <w:rFonts w:ascii="Consolas" w:hAnsi="Consolas"/>
+          <w:highlight w:val="yellow"/>
+        </w:rPr>
+        <w:t>thao</w:t>
+      </w:r>
+      <w:proofErr w:type="spellEnd"/>
+      <w:r>
+        <w:rPr>
+          <w:rFonts w:ascii="Consolas" w:hAnsi="Consolas"/>
+          <w:highlight w:val="yellow"/>
+        </w:rPr>
+        <w:t xml:space="preserve"> </w:t>
+      </w:r>
+      <w:proofErr w:type="spellStart"/>
+      <w:r>
+        <w:rPr>
+          <w:rFonts w:ascii="Consolas" w:hAnsi="Consolas"/>
+          <w:highlight w:val="yellow"/>
+        </w:rPr>
+        <w:t>tác</w:t>
+      </w:r>
+      <w:proofErr w:type="spellEnd"/>
+      <w:r>
+        <w:rPr>
+          <w:rFonts w:ascii="Consolas" w:hAnsi="Consolas"/>
+          <w:highlight w:val="yellow"/>
+        </w:rPr>
+        <w:t xml:space="preserve"> git</w:t>
+      </w:r>
+    </w:p>
+    <w:p>
+      <w:pPr>
+        <w:rPr>
+          <w:b/>
+          <w:bCs/>
+        </w:rPr>
+      </w:pPr>
+      <w:r>
+        <w:rPr>
+          <w:b/>
+          <w:bCs/>
+        </w:rPr>
+        <w:t xml:space="preserve">1. </w:t>
+      </w:r>
+      <w:proofErr w:type="spellStart"/>
+      <w:r>
+        <w:rPr>
+          <w:b/>
+          <w:bCs/>
+        </w:rPr>
+        <w:t>Cấu</w:t>
       </w:r>
       <w:proofErr w:type="spellEnd"/>
       <w:r>
@@ -893,7 +1085,7 @@
     <w:p>
       <w:r>
         <w:pict w14:anchorId="09446F00">
-          <v:rect id="_x0000_i1049" style="width:0;height:1.5pt" o:hralign="center" o:hrstd="t" o:hr="t" fillcolor="#a0a0a0" stroked="f"/>
+          <v:rect id="_x0000_i1025" style="width:0;height:1.5pt" o:hralign="center" o:hrstd="t" o:hr="t" fillcolor="#a0a0a0" stroked="f"/>
         </w:pict>
       </w:r>
     </w:p>
@@ -1922,6 +2114,7 @@
                 <w:b/>
                 <w:bCs/>
               </w:rPr>
+              <w:lastRenderedPageBreak/>
               <w:t>test</w:t>
             </w:r>
           </w:p>
@@ -2006,7 +2199,6 @@
                 <w:b/>
                 <w:bCs/>
               </w:rPr>
-              <w:lastRenderedPageBreak/>
               <w:t>chore</w:t>
             </w:r>
           </w:p>
@@ -2134,7 +2326,7 @@
     <w:p>
       <w:r>
         <w:pict w14:anchorId="21630C3F">
-          <v:rect id="_x0000_i1050" style="width:0;height:1.5pt" o:hralign="center" o:hrstd="t" o:hr="t" fillcolor="#a0a0a0" stroked="f"/>
+          <v:rect id="_x0000_i1026" style="width:0;height:1.5pt" o:hralign="center" o:hrstd="t" o:hr="t" fillcolor="#a0a0a0" stroked="f"/>
         </w:pict>
       </w:r>
     </w:p>
@@ -2449,7 +2641,7 @@
     <w:p>
       <w:r>
         <w:pict w14:anchorId="6FD99E08">
-          <v:rect id="_x0000_i1051" style="width:0;height:1.5pt" o:hralign="center" o:hrstd="t" o:hr="t" fillcolor="#a0a0a0" stroked="f"/>
+          <v:rect id="_x0000_i1027" style="width:0;height:1.5pt" o:hralign="center" o:hrstd="t" o:hr="t" fillcolor="#a0a0a0" stroked="f"/>
         </w:pict>
       </w:r>
     </w:p>
@@ -2782,7 +2974,7 @@
     <w:p>
       <w:r>
         <w:pict w14:anchorId="63E50A45">
-          <v:rect id="_x0000_i1052" style="width:0;height:1.5pt" o:hralign="center" o:hrstd="t" o:hr="t" fillcolor="#a0a0a0" stroked="f"/>
+          <v:rect id="_x0000_i1028" style="width:0;height:1.5pt" o:hralign="center" o:hrstd="t" o:hr="t" fillcolor="#a0a0a0" stroked="f"/>
         </w:pict>
       </w:r>
     </w:p>
@@ -3323,6 +3515,7 @@
     </w:p>
     <w:p>
       <w:r>
+        <w:lastRenderedPageBreak/>
         <w:t xml:space="preserve">+ </w:t>
       </w:r>
       <w:proofErr w:type="spellStart"/>
@@ -3365,7 +3558,6 @@
     </w:p>
     <w:p>
       <w:r>
-        <w:lastRenderedPageBreak/>
         <w:t xml:space="preserve">chore: </w:t>
       </w:r>
       <w:proofErr w:type="spellStart"/>
@@ -4601,6 +4793,7 @@
   <w:style w:type="character" w:default="1" w:styleId="DefaultParagraphFont">
     <w:name w:val="Default Paragraph Font"/>
     <w:uiPriority w:val="1"/>
+    <w:semiHidden/>
     <w:unhideWhenUsed/>
   </w:style>
   <w:style w:type="table" w:default="1" w:styleId="TableNormal">

</xml_diff>